<commit_message>
Manuscript v2: 2026 wage benchmark scenarios (S6, S7), service-charge provenance, Fig. 7b update
Co-Authored-By: Claude Sonnet 5.5 <noreply@anthropic.com>
Claude-Session: https://claude.ai/code/session_011uTbnWCYBnywPaDnngDcdM
</commit_message>
<xml_diff>
--- a/C_IJIE_manuscript_v2.docx
+++ b/C_IJIE_manuscript_v2.docx
@@ -261,7 +261,7 @@
           <w:b w:val="0"/>
           <w:i w:val="0"/>
         </w:rPr>
-        <w:t>Physical architectural models remain a common medium for communicating building designs, yet few studies compare building information modelling (BIM) combined with desktop fused deposition modelling (FDM) against manual model-making using itemised cost and time records. This study documents a BIM-to-FDM workflow and compares it with manual fabrication of a 1:60 model of a two-storey reinforced-concrete house with approximately 315 m² of usable area. The BIM model was developed in Autodesk Revit, exported as a binary STL file, sliced in Ultimaker Cura, printed in separate parts on a desktop FDM printer and assembled with adhesive. The manual model was cut from Plaswood sheets and clear PVC using printed 1:60 plans. Costs were recorded as materials, labour (manual route) and printer service charge (printing route), together with fabrication duration. The manual route cost 7,220 THB and took 6 days, whereas the BIM-to-FDM route cost 10,000 THB and took 3 days. Printing therefore halved the fabrication time but increased the cost by 38.5%, largely because the printer service charge (8,800 THB) represented 88% of the printing-route cost. A sensitivity analysis based on the recorded values indicated that cost parity would occur at a service charge of 6,020 THB or at a daily wage of about 504 THB per person, and that including the reported 1–2 days of Revit modelling would reduce the time saving to 17–33%. Door and window frames could not be printed with the printer used. Because the study covers one building, one printer and one team, the results are exploratory. They suggest that the economic case for BIM-to-FDM models depends mainly on how printer use is charged and on whether the BIM model is reused for other purposes.</w:t>
+        <w:t>Physical architectural models remain a common medium for communicating building designs, yet few studies compare building information modelling (BIM) combined with desktop fused deposition modelling (FDM) against manual model-making using itemised cost and time records. This study documents a BIM-to-FDM workflow and compares it with manual fabrication of a 1:60 model of a two-storey reinforced-concrete house with approximately 315 m² of usable area. The BIM model was developed in Autodesk Revit, exported as a binary STL file, sliced in Ultimaker Cura, printed in separate parts on a desktop FDM printer and assembled with adhesive. The manual model was cut from Plaswood sheets and clear PVC using printed 1:60 plans. Costs were recorded as materials, labour (manual route) and printer service charge (printing route), together with fabrication duration. The manual route cost 7,220 THB and took 6 days, whereas the BIM-to-FDM route cost 10,000 THB and took 3 days. Printing therefore halved the fabrication time but increased the cost by 38.5%, largely because the printer service charge (8,800 THB) represented 88% of the printing-route cost. A sensitivity analysis based on the recorded values indicated that cost parity would occur at a service charge of 6,020 THB or at a daily wage of about 504 THB per person (at the 2026 Bangkok minimum wage of 400 THB per day the cost premium would be 23.2%), and that including the reported 1–2 days of Revit modelling would reduce the time saving to 17–33%. Door and window frames could not be printed with the printer used. Because the study covers one building, one printer and one team, the results are exploratory. They suggest that the economic case for BIM-to-FDM models depends mainly on how printer use is charged and on whether the BIM model is reused for other purposes.</w:t>
       </w:r>
     </w:p>
     <w:p>
@@ -848,7 +848,7 @@
           <w:b w:val="0"/>
           <w:i w:val="0"/>
         </w:rPr>
-        <w:t>Costs were recorded in Thai baht (THB) under three headings (Table 1). For the manual route, materials comprised Plaswood sheets, adhesive, cutter, cutting mat and ruler, and labour was calculated as the number of persons × number of days × daily wage. For the printing route, materials comprised filament and electricity, and a printer service charge was recorded for three days of printer use. No labour cost was recorded for the printing route, so slicing, supervision, gluing and assembly effort is not represented. Duration was the elapsed number of days to complete each model. The project report states the daily wage as 350 THB in the calculation and 300 THB in the accompanying table text; 350 THB was used for the baseline and 300 THB is tested in Section 3.3. For context, Thai wage regulation distinguishes a statutory daily minimum wage, set at 330–370 THB depending on the province from 1 January 2024 (Wages Committee, 2023a), from higher wage rates for trades that hold a national skill standard (Wages Committee, 2023b). The recorded wage of 350 THB lies within the 2024 minimum-wage range and below the skill-standard rates, so it is more consistent with unskilled or student labour than with skilled model-making labour. [Authors to confirm the year of the project records and to verify both figures against the primary notifications before submission.] The composition of the printer service charge (for example machine depreciation, operator time or a fee-for-service rate) was not itemised.</w:t>
+        <w:t>Costs were recorded in Thai baht (THB) under three headings (Table 1). For the manual route, materials comprised Plaswood sheets, adhesive, cutter, cutting mat and ruler, and labour was calculated as the number of persons × number of days × daily wage. For the printing route, materials comprised filament and electricity, and a printer service charge was recorded for three days of printer use (the project report states 8,800 THB for the use of the 3D printer for three days). No labour cost was recorded for the printing route, so slicing, supervision, gluing and assembly effort is not represented. Duration was the elapsed number of days to complete each model. The project report states the daily wage as 350 THB in the calculation and 300 THB in the accompanying table text; 350 THB was used for the baseline and 300 THB is tested in Section 3.3. For context, Thai wage regulation distinguishes a statutory daily minimum wage, which in 2026 ranges from 337 to 400 THB depending on the province and is 400 THB in Bangkok (Wages Committee, 2026), from higher wage rates for trades that hold a national skill standard, for example 445, 595 and 685 THB per day for skill levels 1–3 of construction carpentry (Wages Committee, 2023). The recorded wages of 300 and 350 THB are retained for the baseline because they are the project's records; 350 THB lies within the 2026 provincial minimum-wage range but below the Bangkok rate, and 300 THB lies below it. The 2026 values are therefore used as an updated benchmark in Section 3.3 (scenarios S6 and S7). [Authors to confirm: these figures were taken from secondary summaries and must be verified against the primary notifications before submission.]</w:t>
       </w:r>
     </w:p>
     <w:p>
@@ -3236,7 +3236,7 @@
           <w:b w:val="0"/>
           <w:i w:val="0"/>
         </w:rPr>
-        <w:t>Table 4 and Fig. 7 show how the conclusion changes with the accounting assumptions. Cost parity would be reached if the printer service charge fell from 8,800 THB to 6,020 THB (a reduction of 31.6%), or if the daily wage were about 504 THB per person instead of 350 THB. Conversely, using the lower wage of 300 THB increases the premium of printing to 58.2%. The time saving is also sensitive to the treatment of BIM modelling: adding one or two days of Revit modelling to the printing route reduces the duration advantage from 50% to 33.3% or 16.7%, and adds 350–700 THB if one operator is assumed, raising the cost premium to 43.4–48.2%. [Authors to verify: the break-even wage of about 504 THB should be compared with the skill-standard wage rates in the primary Wages Committee notification (2023b) before this comparison is stated in the text.]</w:t>
+        <w:t>Table 4 and Fig. 7 show how the conclusion changes with the accounting assumptions. Cost parity would be reached if the printer service charge fell from 8,800 THB to 6,020 THB (a reduction of 31.6%), or if the daily wage were about 504 THB per person instead of 350 THB. Conversely, using the lower wage of 300 THB increases the premium of printing to 58.2%. The time saving is also sensitive to the treatment of BIM modelling: adding one or two days of Revit modelling to the printing route reduces the duration advantage from 50% to 33.3% or 16.7%, and adds 350–700 THB if one operator is assumed, raising the cost premium to 43.4–48.2%. Using the 2026 wage benchmarks, the premium of printing falls to 1,880 THB (23.2%) at the Bangkok minimum wage of 400 THB per day (S6) and to 1,070 THB (12.0%) at 445 THB per day, the skill level 1 carpentry rate (S7, illustrative because undergraduate model-making is not a certified trade); both remain below the break-even wage of about 504 THB, so printing is still more expensive at these wages. [Authors to verify the 2026 wage figures against the primary notifications (Wages Committee, 2023, 2026).]</w:t>
       </w:r>
     </w:p>
     <w:p>
@@ -4216,6 +4216,298 @@
           </w:p>
         </w:tc>
       </w:tr>
+      <w:tr>
+        <w:tc>
+          <w:tcPr>
+            <w:tcW w:type="dxa" w:w="2438"/>
+            <w:tcBorders>
+              <w:bottom w:val="single" w:sz="10" w:space="0" w:color="000000"/>
+            </w:tcBorders>
+          </w:tcPr>
+          <w:p>
+            <w:pPr>
+              <w:keepNext w:val="0"/>
+              <w:spacing w:after="20" w:before="20" w:line="240" w:lineRule="auto"/>
+              <w:jc w:val="left"/>
+            </w:pPr>
+            <w:r>
+              <w:rPr>
+                <w:rFonts w:ascii="Times New Roman" w:hAnsi="Times New Roman" w:eastAsia="Times New Roman"/>
+                <w:b w:val="0"/>
+                <w:i w:val="0"/>
+                <w:sz w:val="19"/>
+              </w:rPr>
+              <w:t>S6 Daily wage 400 THB (2026 Bangkok minimum)</w:t>
+            </w:r>
+          </w:p>
+        </w:tc>
+        <w:tc>
+          <w:tcPr>
+            <w:tcW w:type="dxa" w:w="1247"/>
+            <w:tcBorders>
+              <w:bottom w:val="single" w:sz="10" w:space="0" w:color="000000"/>
+            </w:tcBorders>
+          </w:tcPr>
+          <w:p>
+            <w:pPr>
+              <w:keepNext w:val="0"/>
+              <w:spacing w:after="20" w:before="20" w:line="240" w:lineRule="auto"/>
+              <w:jc w:val="center"/>
+            </w:pPr>
+            <w:r>
+              <w:rPr>
+                <w:rFonts w:ascii="Times New Roman" w:hAnsi="Times New Roman" w:eastAsia="Times New Roman"/>
+                <w:b w:val="0"/>
+                <w:i w:val="0"/>
+                <w:sz w:val="19"/>
+              </w:rPr>
+              <w:t>8,120</w:t>
+            </w:r>
+          </w:p>
+        </w:tc>
+        <w:tc>
+          <w:tcPr>
+            <w:tcW w:type="dxa" w:w="1304"/>
+            <w:tcBorders>
+              <w:bottom w:val="single" w:sz="10" w:space="0" w:color="000000"/>
+            </w:tcBorders>
+          </w:tcPr>
+          <w:p>
+            <w:pPr>
+              <w:keepNext w:val="0"/>
+              <w:spacing w:after="20" w:before="20" w:line="240" w:lineRule="auto"/>
+              <w:jc w:val="center"/>
+            </w:pPr>
+            <w:r>
+              <w:rPr>
+                <w:rFonts w:ascii="Times New Roman" w:hAnsi="Times New Roman" w:eastAsia="Times New Roman"/>
+                <w:b w:val="0"/>
+                <w:i w:val="0"/>
+                <w:sz w:val="19"/>
+              </w:rPr>
+              <w:t>10,000</w:t>
+            </w:r>
+          </w:p>
+        </w:tc>
+        <w:tc>
+          <w:tcPr>
+            <w:tcW w:type="dxa" w:w="1757"/>
+            <w:tcBorders>
+              <w:bottom w:val="single" w:sz="10" w:space="0" w:color="000000"/>
+            </w:tcBorders>
+          </w:tcPr>
+          <w:p>
+            <w:pPr>
+              <w:keepNext w:val="0"/>
+              <w:spacing w:after="20" w:before="20" w:line="240" w:lineRule="auto"/>
+              <w:jc w:val="center"/>
+            </w:pPr>
+            <w:r>
+              <w:rPr>
+                <w:rFonts w:ascii="Times New Roman" w:hAnsi="Times New Roman" w:eastAsia="Times New Roman"/>
+                <w:b w:val="0"/>
+                <w:i w:val="0"/>
+                <w:sz w:val="19"/>
+              </w:rPr>
+              <w:t>+1,880 (+23.2%)</w:t>
+            </w:r>
+          </w:p>
+        </w:tc>
+        <w:tc>
+          <w:tcPr>
+            <w:tcW w:type="dxa" w:w="1474"/>
+            <w:tcBorders>
+              <w:bottom w:val="single" w:sz="10" w:space="0" w:color="000000"/>
+            </w:tcBorders>
+          </w:tcPr>
+          <w:p>
+            <w:pPr>
+              <w:keepNext w:val="0"/>
+              <w:spacing w:after="20" w:before="20" w:line="240" w:lineRule="auto"/>
+              <w:jc w:val="center"/>
+            </w:pPr>
+            <w:r>
+              <w:rPr>
+                <w:rFonts w:ascii="Times New Roman" w:hAnsi="Times New Roman" w:eastAsia="Times New Roman"/>
+                <w:b w:val="0"/>
+                <w:i w:val="0"/>
+                <w:sz w:val="19"/>
+              </w:rPr>
+              <w:t>3</w:t>
+            </w:r>
+          </w:p>
+        </w:tc>
+        <w:tc>
+          <w:tcPr>
+            <w:tcW w:type="dxa" w:w="1304"/>
+            <w:tcBorders>
+              <w:bottom w:val="single" w:sz="10" w:space="0" w:color="000000"/>
+            </w:tcBorders>
+          </w:tcPr>
+          <w:p>
+            <w:pPr>
+              <w:keepNext w:val="0"/>
+              <w:spacing w:after="20" w:before="20" w:line="240" w:lineRule="auto"/>
+              <w:jc w:val="center"/>
+            </w:pPr>
+            <w:r>
+              <w:rPr>
+                <w:rFonts w:ascii="Times New Roman" w:hAnsi="Times New Roman" w:eastAsia="Times New Roman"/>
+                <w:b w:val="0"/>
+                <w:i w:val="0"/>
+                <w:sz w:val="19"/>
+              </w:rPr>
+              <w:t>50.0%</w:t>
+            </w:r>
+          </w:p>
+        </w:tc>
+      </w:tr>
+      <w:tr>
+        <w:tc>
+          <w:tcPr>
+            <w:tcW w:type="dxa" w:w="2438"/>
+            <w:tcBorders>
+              <w:bottom w:val="single" w:sz="10" w:space="0" w:color="000000"/>
+            </w:tcBorders>
+          </w:tcPr>
+          <w:p>
+            <w:pPr>
+              <w:keepNext w:val="0"/>
+              <w:spacing w:after="20" w:before="20" w:line="240" w:lineRule="auto"/>
+              <w:jc w:val="left"/>
+            </w:pPr>
+            <w:r>
+              <w:rPr>
+                <w:rFonts w:ascii="Times New Roman" w:hAnsi="Times New Roman" w:eastAsia="Times New Roman"/>
+                <w:b w:val="0"/>
+                <w:i w:val="0"/>
+                <w:sz w:val="19"/>
+              </w:rPr>
+              <w:t>S7 Daily wage 445 THB (2026 skill level 1, carpentry)</w:t>
+            </w:r>
+          </w:p>
+        </w:tc>
+        <w:tc>
+          <w:tcPr>
+            <w:tcW w:type="dxa" w:w="1247"/>
+            <w:tcBorders>
+              <w:bottom w:val="single" w:sz="10" w:space="0" w:color="000000"/>
+            </w:tcBorders>
+          </w:tcPr>
+          <w:p>
+            <w:pPr>
+              <w:keepNext w:val="0"/>
+              <w:spacing w:after="20" w:before="20" w:line="240" w:lineRule="auto"/>
+              <w:jc w:val="center"/>
+            </w:pPr>
+            <w:r>
+              <w:rPr>
+                <w:rFonts w:ascii="Times New Roman" w:hAnsi="Times New Roman" w:eastAsia="Times New Roman"/>
+                <w:b w:val="0"/>
+                <w:i w:val="0"/>
+                <w:sz w:val="19"/>
+              </w:rPr>
+              <w:t>8,930</w:t>
+            </w:r>
+          </w:p>
+        </w:tc>
+        <w:tc>
+          <w:tcPr>
+            <w:tcW w:type="dxa" w:w="1304"/>
+            <w:tcBorders>
+              <w:bottom w:val="single" w:sz="10" w:space="0" w:color="000000"/>
+            </w:tcBorders>
+          </w:tcPr>
+          <w:p>
+            <w:pPr>
+              <w:keepNext w:val="0"/>
+              <w:spacing w:after="20" w:before="20" w:line="240" w:lineRule="auto"/>
+              <w:jc w:val="center"/>
+            </w:pPr>
+            <w:r>
+              <w:rPr>
+                <w:rFonts w:ascii="Times New Roman" w:hAnsi="Times New Roman" w:eastAsia="Times New Roman"/>
+                <w:b w:val="0"/>
+                <w:i w:val="0"/>
+                <w:sz w:val="19"/>
+              </w:rPr>
+              <w:t>10,000</w:t>
+            </w:r>
+          </w:p>
+        </w:tc>
+        <w:tc>
+          <w:tcPr>
+            <w:tcW w:type="dxa" w:w="1757"/>
+            <w:tcBorders>
+              <w:bottom w:val="single" w:sz="10" w:space="0" w:color="000000"/>
+            </w:tcBorders>
+          </w:tcPr>
+          <w:p>
+            <w:pPr>
+              <w:keepNext w:val="0"/>
+              <w:spacing w:after="20" w:before="20" w:line="240" w:lineRule="auto"/>
+              <w:jc w:val="center"/>
+            </w:pPr>
+            <w:r>
+              <w:rPr>
+                <w:rFonts w:ascii="Times New Roman" w:hAnsi="Times New Roman" w:eastAsia="Times New Roman"/>
+                <w:b w:val="0"/>
+                <w:i w:val="0"/>
+                <w:sz w:val="19"/>
+              </w:rPr>
+              <w:t>+1,070 (+12.0%)</w:t>
+            </w:r>
+          </w:p>
+        </w:tc>
+        <w:tc>
+          <w:tcPr>
+            <w:tcW w:type="dxa" w:w="1474"/>
+            <w:tcBorders>
+              <w:bottom w:val="single" w:sz="10" w:space="0" w:color="000000"/>
+            </w:tcBorders>
+          </w:tcPr>
+          <w:p>
+            <w:pPr>
+              <w:keepNext w:val="0"/>
+              <w:spacing w:after="20" w:before="20" w:line="240" w:lineRule="auto"/>
+              <w:jc w:val="center"/>
+            </w:pPr>
+            <w:r>
+              <w:rPr>
+                <w:rFonts w:ascii="Times New Roman" w:hAnsi="Times New Roman" w:eastAsia="Times New Roman"/>
+                <w:b w:val="0"/>
+                <w:i w:val="0"/>
+                <w:sz w:val="19"/>
+              </w:rPr>
+              <w:t>3</w:t>
+            </w:r>
+          </w:p>
+        </w:tc>
+        <w:tc>
+          <w:tcPr>
+            <w:tcW w:type="dxa" w:w="1304"/>
+            <w:tcBorders>
+              <w:bottom w:val="single" w:sz="10" w:space="0" w:color="000000"/>
+            </w:tcBorders>
+          </w:tcPr>
+          <w:p>
+            <w:pPr>
+              <w:keepNext w:val="0"/>
+              <w:spacing w:after="20" w:before="20" w:line="240" w:lineRule="auto"/>
+              <w:jc w:val="center"/>
+            </w:pPr>
+            <w:r>
+              <w:rPr>
+                <w:rFonts w:ascii="Times New Roman" w:hAnsi="Times New Roman" w:eastAsia="Times New Roman"/>
+                <w:b w:val="0"/>
+                <w:i w:val="0"/>
+                <w:sz w:val="19"/>
+              </w:rPr>
+              <w:t>50.0%</w:t>
+            </w:r>
+          </w:p>
+        </w:tc>
+      </w:tr>
     </w:tbl>
     <w:p>
       <w:pPr>
@@ -4237,7 +4529,7 @@
           <w:i w:val="0"/>
           <w:sz w:val="19"/>
         </w:rPr>
-        <w:t xml:space="preserve"> S2 and S3 are break-even points calculated with Eq. (3). S4 and S5 assume one operator at 350 THB/day for the added modelling days (illustrative assumption). Percentages are relative to the manual cost or duration.</w:t>
+        <w:t xml:space="preserve"> S2 and S3 are break-even points calculated with Eq. (3). S4 and S5 assume one operator at 350 THB/day for the added modelling days (illustrative assumption). Percentages are relative to the manual cost or duration. S6 and S7 use 2026 wage benchmarks (Wages Committee, 2023, 2026) with 3 persons × 6 days; the figures are to be verified against the primary notifications.</w:t>
       </w:r>
     </w:p>
     <w:p>
@@ -4302,7 +4594,7 @@
           <w:i w:val="0"/>
           <w:sz w:val="21"/>
         </w:rPr>
-        <w:t>Sensitivity of the comparison to (a) printer service charge, (b) daily wage and (c) Revit modelling time added to the printing route. Break-even points are 6,020 THB and about 504 THB per person per day.</w:t>
+        <w:t>Sensitivity of the comparison to (a) printer service charge, (b) daily wage and (c) Revit modelling time added to the printing route. Break-even points are 6,020 THB and about 504 THB per person per day. The 2026 Bangkok minimum wage (400 THB) is marked in (b).</w:t>
       </w:r>
     </w:p>
     <w:p>
@@ -5059,7 +5351,7 @@
           <w:b w:val="0"/>
           <w:i w:val="0"/>
         </w:rPr>
-        <w:t>The cost difference was governed by the printer service charge, which accounted for 88% of the printing cost. Cost parity would occur at a service charge of 6,020 THB or a wage of about 504 THB per person per day.</w:t>
+        <w:t>The cost difference was governed by the printer service charge, which accounted for 88% of the printing cost. Cost parity would occur at a service charge of 6,020 THB or a wage of about 504 THB per person per day. At the 2026 Bangkok minimum wage (400 THB per day) the cost premium would be 23.2%.</w:t>
       </w:r>
     </w:p>
     <w:p>
@@ -6239,7 +6531,7 @@
           <w:i w:val="0"/>
           <w:sz w:val="22"/>
         </w:rPr>
-        <w:t>Wages Committee. (2023a). [Notification on the minimum wage rate effective 1 January 2024] [Official notification, in Thai]. Ministry of Labour, Thailand. [Notification number, Royal Gazette citation and URL to be added from the primary source before submission]</w:t>
+        <w:t>Wages Committee. (2023). Notification of the Wages Committee re: Wage rate according to skill standards (No. 13), dated 29 September 2023 [Official notification, in Thai]. Ministry of Labour, Thailand. [Royal Gazette citation and URL to be added from the primary source before submission]</w:t>
       </w:r>
     </w:p>
     <w:p>
@@ -6255,7 +6547,7 @@
           <w:i w:val="0"/>
           <w:sz w:val="22"/>
         </w:rPr>
-        <w:t>Wages Committee. (2023b). Notification of the Wages Committee re: Wage rate according to skill standards (No. 13), dated 29 September 2023 [Official notification, in Thai]. Ministry of Labour, Thailand. [Royal Gazette citation and URL to be added from the primary source before submission]</w:t>
+        <w:t>Wages Committee. (2026). [Notification on the minimum wage rates in force in 2026] [Official notification, in Thai]. Ministry of Labour, Thailand. [Notification number, Royal Gazette citation, effective date and URL to be added from the primary source before submission]</w:t>
       </w:r>
     </w:p>
     <w:p>

</xml_diff>

<commit_message>
Manuscript v2: correct wage benchmarks to primary-source values (Wages Committee No. 12 and No. 13)
Co-Authored-By: Claude Sonnet 5.5 <noreply@anthropic.com>
Claude-Session: https://claude.ai/code/session_011uTbnWCYBnywPaDnngDcdM
</commit_message>
<xml_diff>
--- a/C_IJIE_manuscript_v2.docx
+++ b/C_IJIE_manuscript_v2.docx
@@ -261,7 +261,7 @@
           <w:b w:val="0"/>
           <w:i w:val="0"/>
         </w:rPr>
-        <w:t>Physical architectural models remain a common medium for communicating building designs, yet few studies compare building information modelling (BIM) combined with desktop fused deposition modelling (FDM) against manual model-making using itemised cost and time records. This study documents a BIM-to-FDM workflow and compares it with manual fabrication of a 1:60 model of a two-storey reinforced-concrete house with approximately 315 m² of usable area. The BIM model was developed in Autodesk Revit, exported as a binary STL file, sliced in Ultimaker Cura, printed in separate parts on a desktop FDM printer and assembled with adhesive. The manual model was cut from Plaswood sheets and clear PVC using printed 1:60 plans. Costs were recorded as materials, labour (manual route) and printer service charge (printing route), together with fabrication duration. The manual route cost 7,220 THB and took 6 days, whereas the BIM-to-FDM route cost 10,000 THB and took 3 days. Printing therefore halved the fabrication time but increased the cost by 38.5%, largely because the printer service charge (8,800 THB) represented 88% of the printing-route cost. A sensitivity analysis based on the recorded values indicated that cost parity would occur at a service charge of 6,020 THB or at a daily wage of about 504 THB per person (at the 2026 Bangkok minimum wage of 400 THB per day the cost premium would be 23.2%), and that including the reported 1–2 days of Revit modelling would reduce the time saving to 17–33%. Door and window frames could not be printed with the printer used. Because the study covers one building, one printer and one team, the results are exploratory. They suggest that the economic case for BIM-to-FDM models depends mainly on how printer use is charged and on whether the BIM model is reused for other purposes.</w:t>
+        <w:t>Physical architectural models remain a common medium for communicating building designs, yet few studies compare building information modelling (BIM) combined with desktop fused deposition modelling (FDM) against manual model-making using itemised cost and time records. This study documents a BIM-to-FDM workflow and compares it with manual fabrication of a 1:60 model of a two-storey reinforced-concrete house with approximately 315 m² of usable area. The BIM model was developed in Autodesk Revit, exported as a binary STL file, sliced in Ultimaker Cura, printed in separate parts on a desktop FDM printer and assembled with adhesive. The manual model was cut from Plaswood sheets and clear PVC using printed 1:60 plans. Costs were recorded as materials, labour (manual route) and printer service charge (printing route), together with fabrication duration. The manual route cost 7,220 THB and took 6 days, whereas the BIM-to-FDM route cost 10,000 THB and took 3 days. Printing therefore halved the fabrication time but increased the cost by 38.5%, largely because the printer service charge (8,800 THB) represented 88% of the printing-route cost. A sensitivity analysis based on the recorded values indicated that cost parity would occur at a service charge of 6,020 THB or at a daily wage of about 504 THB per person (at the 2024 Bangkok minimum wage of 363 THB per day the cost premium would be 34.2%), and that including the reported 1–2 days of Revit modelling would reduce the time saving to 17–33%. Door and window frames could not be printed with the printer used. Because the study covers one building, one printer and one team, the results are exploratory. They suggest that the economic case for BIM-to-FDM models depends mainly on how printer use is charged and on whether the BIM model is reused for other purposes.</w:t>
       </w:r>
     </w:p>
     <w:p>
@@ -848,7 +848,7 @@
           <w:b w:val="0"/>
           <w:i w:val="0"/>
         </w:rPr>
-        <w:t>Costs were recorded in Thai baht (THB) under three headings (Table 1). For the manual route, materials comprised Plaswood sheets, adhesive, cutter, cutting mat and ruler, and labour was calculated as the number of persons × number of days × daily wage. For the printing route, materials comprised filament and electricity, and a printer service charge was recorded for three days of printer use (the project report states 8,800 THB for the use of the 3D printer for three days). No labour cost was recorded for the printing route, so slicing, supervision, gluing and assembly effort is not represented. Duration was the elapsed number of days to complete each model. The project report states the daily wage as 350 THB in the calculation and 300 THB in the accompanying table text; 350 THB was used for the baseline and 300 THB is tested in Section 3.3. For context, Thai wage regulation distinguishes a statutory daily minimum wage, which in 2026 ranges from 337 to 400 THB depending on the province and is 400 THB in Bangkok (Wages Committee, 2026), from higher wage rates for trades that hold a national skill standard, for example 445, 595 and 685 THB per day for skill levels 1–3 of construction carpentry (Wages Committee, 2023). The recorded wages of 300 and 350 THB are retained for the baseline because they are the project's records; 350 THB lies within the 2026 provincial minimum-wage range but below the Bangkok rate, and 300 THB lies below it. The 2026 values are therefore used as an updated benchmark in Section 3.3 (scenarios S6 and S7). [Authors to confirm: these figures were taken from secondary summaries and must be verified against the primary notifications before submission.]</w:t>
+        <w:t>Costs were recorded in Thai baht (THB) under three headings (Table 1). For the manual route, materials comprised Plaswood sheets, adhesive, cutter, cutting mat and ruler, and labour was calculated as the number of persons × number of days × daily wage. For the printing route, materials comprised filament and electricity, and a printer service charge was recorded for three days of printer use (the project report states 8,800 THB for the use of the 3D printer for three days). No labour cost was recorded for the printing route, so slicing, supervision, gluing and assembly effort is not represented. Duration was the elapsed number of days to complete each model. The project report states the daily wage as 350 THB in the calculation and 300 THB in the accompanying table text; 350 THB was used for the baseline and 300 THB is tested in Section 3.3. For context, Thai wage regulation distinguishes a statutory daily minimum wage from higher wage rates for trades that hold a national skill standard. Under the Wages Committee notification in force from 1 January 2024, the minimum wage ranged from 330 to 370 THB per day depending on the province and was 363 THB in Bangkok (Wages Committee, 2023a). The skill-standard notification (No. 13) sets minimum daily rates for construction carpentry of 445, 595 and 685 THB for skill levels 1–3 (Wages Committee, 2023b). The recorded wages of 300 and 350 THB are retained for the baseline because they are the project's records; 300 THB lies below the 2024 minimum wage in every province, and 350 THB lies within the provincial range but below the Bangkok rate. The 2024 values are used as an official benchmark in Section 3.3 (scenarios S6 and S7). [Authors to confirm the year of the project records and whether a more recent minimum-wage notification applies at the time of submission.]</w:t>
       </w:r>
     </w:p>
     <w:p>
@@ -3236,7 +3236,7 @@
           <w:b w:val="0"/>
           <w:i w:val="0"/>
         </w:rPr>
-        <w:t>Table 4 and Fig. 7 show how the conclusion changes with the accounting assumptions. Cost parity would be reached if the printer service charge fell from 8,800 THB to 6,020 THB (a reduction of 31.6%), or if the daily wage were about 504 THB per person instead of 350 THB. Conversely, using the lower wage of 300 THB increases the premium of printing to 58.2%. The time saving is also sensitive to the treatment of BIM modelling: adding one or two days of Revit modelling to the printing route reduces the duration advantage from 50% to 33.3% or 16.7%, and adds 350–700 THB if one operator is assumed, raising the cost premium to 43.4–48.2%. Using the 2026 wage benchmarks, the premium of printing falls to 1,880 THB (23.2%) at the Bangkok minimum wage of 400 THB per day (S6) and to 1,070 THB (12.0%) at 445 THB per day, the skill level 1 carpentry rate (S7, illustrative because undergraduate model-making is not a certified trade); both remain below the break-even wage of about 504 THB, so printing is still more expensive at these wages. [Authors to verify the 2026 wage figures against the primary notifications (Wages Committee, 2023, 2026).]</w:t>
+        <w:t>Table 4 and Fig. 7 show how the conclusion changes with the accounting assumptions. Cost parity would be reached if the printer service charge fell from 8,800 THB to 6,020 THB (a reduction of 31.6%), or if the daily wage were about 504 THB per person instead of 350 THB. Conversely, using the lower wage of 300 THB increases the premium of printing to 58.2%. The time saving is also sensitive to the treatment of BIM modelling: adding one or two days of Revit modelling to the printing route reduces the duration advantage from 50% to 33.3% or 16.7%, and adds 350–700 THB if one operator is assumed, raising the cost premium to 43.4–48.2%. Using the official 2024 benchmarks, the premium of printing is 2,546 THB (34.2%) at the Bangkok minimum wage of 363 THB per day (S6) and 1,070 THB (12.0%) at 445 THB per day, the skill level 1 carpentry rate (S7, illustrative because undergraduate model-making is not a certified trade). Both wages are below the break-even wage of about 504 THB, so printing remains more expensive at these wages. The break-even wage lies between the skill level 1 (445 THB) and level 2 (595 THB) carpentry rates, so printing would be cheaper only if manual labour were valued at a level-2 rate or higher (Wages Committee, 2023b).</w:t>
       </w:r>
     </w:p>
     <w:p>
@@ -4237,7 +4237,7 @@
                 <w:i w:val="0"/>
                 <w:sz w:val="19"/>
               </w:rPr>
-              <w:t>S6 Daily wage 400 THB (2026 Bangkok minimum)</w:t>
+              <w:t>S6 Daily wage 363 THB (2024 Bangkok minimum)</w:t>
             </w:r>
           </w:p>
         </w:tc>
@@ -4261,7 +4261,7 @@
                 <w:i w:val="0"/>
                 <w:sz w:val="19"/>
               </w:rPr>
-              <w:t>8,120</w:t>
+              <w:t>7,454</w:t>
             </w:r>
           </w:p>
         </w:tc>
@@ -4309,7 +4309,7 @@
                 <w:i w:val="0"/>
                 <w:sz w:val="19"/>
               </w:rPr>
-              <w:t>+1,880 (+23.2%)</w:t>
+              <w:t>+2,546 (+34.2%)</w:t>
             </w:r>
           </w:p>
         </w:tc>
@@ -4383,7 +4383,7 @@
                 <w:i w:val="0"/>
                 <w:sz w:val="19"/>
               </w:rPr>
-              <w:t>S7 Daily wage 445 THB (2026 skill level 1, carpentry)</w:t>
+              <w:t>S7 Daily wage 445 THB (skill level 1, carpentry)</w:t>
             </w:r>
           </w:p>
         </w:tc>
@@ -4529,7 +4529,7 @@
           <w:i w:val="0"/>
           <w:sz w:val="19"/>
         </w:rPr>
-        <w:t xml:space="preserve"> S2 and S3 are break-even points calculated with Eq. (3). S4 and S5 assume one operator at 350 THB/day for the added modelling days (illustrative assumption). Percentages are relative to the manual cost or duration. S6 and S7 use 2026 wage benchmarks (Wages Committee, 2023, 2026) with 3 persons × 6 days; the figures are to be verified against the primary notifications.</w:t>
+        <w:t xml:space="preserve"> S2 and S3 are break-even points calculated with Eq. (3). S4 and S5 assume one operator at 350 THB/day for the added modelling days (illustrative assumption). Percentages are relative to the manual cost or duration. S6 and S7 use official wage benchmarks (Wages Committee, 2023a, 2023b) with 3 persons × 6 days.</w:t>
       </w:r>
     </w:p>
     <w:p>
@@ -4594,7 +4594,7 @@
           <w:i w:val="0"/>
           <w:sz w:val="21"/>
         </w:rPr>
-        <w:t>Sensitivity of the comparison to (a) printer service charge, (b) daily wage and (c) Revit modelling time added to the printing route. Break-even points are 6,020 THB and about 504 THB per person per day. The 2026 Bangkok minimum wage (400 THB) is marked in (b).</w:t>
+        <w:t>Sensitivity of the comparison to (a) printer service charge, (b) daily wage and (c) Revit modelling time added to the printing route. Break-even points are 6,020 THB and about 504 THB per person per day. The 2024 Bangkok minimum wage (363 THB) is marked in (b).</w:t>
       </w:r>
     </w:p>
     <w:p>
@@ -5351,7 +5351,7 @@
           <w:b w:val="0"/>
           <w:i w:val="0"/>
         </w:rPr>
-        <w:t>The cost difference was governed by the printer service charge, which accounted for 88% of the printing cost. Cost parity would occur at a service charge of 6,020 THB or a wage of about 504 THB per person per day. At the 2026 Bangkok minimum wage (400 THB per day) the cost premium would be 23.2%.</w:t>
+        <w:t>The cost difference was governed by the printer service charge, which accounted for 88% of the printing cost. Cost parity would occur at a service charge of 6,020 THB or a wage of about 504 THB per person per day. At the 2024 Bangkok minimum wage (363 THB per day) the cost premium would be 34.2%.</w:t>
       </w:r>
     </w:p>
     <w:p>
@@ -6531,7 +6531,7 @@
           <w:i w:val="0"/>
           <w:sz w:val="22"/>
         </w:rPr>
-        <w:t>Wages Committee. (2023). Notification of the Wages Committee re: Wage rate according to skill standards (No. 13), dated 29 September 2023 [Official notification, in Thai]. Ministry of Labour, Thailand. [Royal Gazette citation and URL to be added from the primary source before submission]</w:t>
+        <w:t>Wages Committee. (2023a). Notification of the Wages Committee re: Minimum wage rate (No. 12), dated 8 December 2023 (effective 1 January 2024) [Official notification, in Thai]. Ministry of Labour, Thailand. https://roiet.labour.go.th/attachments/article/498/%E0%B8%9B%E0%B8%A3%E0%B8%B0%E0%B8%81%E0%B8%B2%E0%B8%A8%E0%B8%84%E0%B8%93%E0%B8%B0%E0%B8%81%E0%B8%A3%E0%B8%A3%E0%B8%A1%E0%B8%81%E0%B8%B2%E0%B8%A3%E0%B8%84%E0%B9%88%E0%B8%B2%E0%B8%88%E0%B9%89%E0%B8%B2%E0%B8%87.pdf [Royal Gazette citation to be added]</w:t>
       </w:r>
     </w:p>
     <w:p>
@@ -6547,7 +6547,7 @@
           <w:i w:val="0"/>
           <w:sz w:val="22"/>
         </w:rPr>
-        <w:t>Wages Committee. (2026). [Notification on the minimum wage rates in force in 2026] [Official notification, in Thai]. Ministry of Labour, Thailand. [Notification number, Royal Gazette citation, effective date and URL to be added from the primary source before submission]</w:t>
+        <w:t>Wages Committee. (2023b). Notification of the Wages Committee re: Wage rate according to skill standards (No. 13), dated 29 September 2023 [Official notification, in Thai]. Ministry of Labour, Thailand. https://roiet.labour.go.th/attachments/article/498/%E0%B8%9B%E0%B8%A3%E0%B8%B0%E0%B8%81%E0%B8%B2%E0%B8%A8%E0%B8%84%E0%B8%93%E0%B8%B0%E0%B8%81%E0%B8%A3%E0%B8%A3%E0%B8%A1%E0%B8%81%E0%B8%B2%E0%B8%A3%E0%B8%84%E0%B9%88%E0%B8%B2%E0%B8%88%E0%B9%89%E0%B8%B2%E0%B8%87.pdf [Royal Gazette citation to be added]</w:t>
       </w:r>
     </w:p>
     <w:p>

</xml_diff>

<commit_message>
Add unverified Royal Gazette citations for Wages Committee references
Co-Authored-By: Claude Sonnet 5.5 <noreply@anthropic.com>
Claude-Session: https://claude.ai/code/session_011uTbnWCYBnywPaDnngDcdM
</commit_message>
<xml_diff>
--- a/C_IJIE_manuscript_v2.docx
+++ b/C_IJIE_manuscript_v2.docx
@@ -6531,7 +6531,7 @@
           <w:i w:val="0"/>
           <w:sz w:val="22"/>
         </w:rPr>
-        <w:t>Wages Committee. (2023a). Notification of the Wages Committee re: Minimum wage rate (No. 12), dated 8 December 2023 (effective 1 January 2024) [Official notification, in Thai]. Ministry of Labour, Thailand. https://roiet.labour.go.th/attachments/article/498/%E0%B8%9B%E0%B8%A3%E0%B8%B0%E0%B8%81%E0%B8%B2%E0%B8%A8%E0%B8%84%E0%B8%93%E0%B8%B0%E0%B8%81%E0%B8%A3%E0%B8%A3%E0%B8%A1%E0%B8%81%E0%B8%B2%E0%B8%A3%E0%B8%84%E0%B9%88%E0%B8%B2%E0%B8%88%E0%B9%89%E0%B8%B2%E0%B8%87.pdf [Royal Gazette citation to be added]</w:t>
+        <w:t>Wages Committee. (2023a). Notification of the Wages Committee re: Minimum wage rate (No. 12), dated 8 December 2023 (effective 1 January 2024) [Official notification, in Thai]. Ministry of Labour, Thailand. https://roiet.labour.go.th/attachments/article/498/%E0%B8%9B%E0%B8%A3%E0%B8%B0%E0%B8%81%E0%B8%B2%E0%B8%A8%E0%B8%84%E0%B8%93%E0%B8%B0%E0%B8%81%E0%B8%A3%E0%B8%A3%E0%B8%A1%E0%B8%81%E0%B8%B2%E0%B8%A3%E0%B8%84%E0%B9%88%E0%B8%B2%E0%B8%88%E0%B9%89%E0%B8%B2%E0%B8%87.pdf Royal Gazette, 140(Special Issue 315 Ng), 29 December 2023. [unverified: volume, section and date taken from a secondary web summary; check against the Royal Gazette original]</w:t>
       </w:r>
     </w:p>
     <w:p>
@@ -6547,7 +6547,7 @@
           <w:i w:val="0"/>
           <w:sz w:val="22"/>
         </w:rPr>
-        <w:t>Wages Committee. (2023b). Notification of the Wages Committee re: Wage rate according to skill standards (No. 13), dated 29 September 2023 [Official notification, in Thai]. Ministry of Labour, Thailand. https://roiet.labour.go.th/attachments/article/498/%E0%B8%9B%E0%B8%A3%E0%B8%B0%E0%B8%81%E0%B8%B2%E0%B8%A8%E0%B8%84%E0%B8%93%E0%B8%B0%E0%B8%81%E0%B8%A3%E0%B8%A3%E0%B8%A1%E0%B8%81%E0%B8%B2%E0%B8%A3%E0%B8%84%E0%B9%88%E0%B8%B2%E0%B8%88%E0%B9%89%E0%B8%B2%E0%B8%87.pdf [Royal Gazette citation to be added]</w:t>
+        <w:t>Wages Committee. (2023b). Notification of the Wages Committee re: Wage rate according to skill standards (No. 13), dated 29 September 2023 [Official notification, in Thai]. Ministry of Labour, Thailand. https://roiet.labour.go.th/attachments/article/498/%E0%B8%9B%E0%B8%A3%E0%B8%B0%E0%B8%81%E0%B8%B2%E0%B8%A8%E0%B8%84%E0%B8%93%E0%B8%B0%E0%B8%81%E0%B8%A3%E0%B8%A3%E0%B8%A1%E0%B8%81%E0%B8%B2%E0%B8%A3%E0%B8%84%E0%B9%88%E0%B8%B2%E0%B8%88%E0%B9%89%E0%B8%B2%E0%B8%87.pdf Royal Gazette, published 19 December 2023 (effective 18 March 2024). [unverified: publication date from a secondary web summary; volume, section and page still to be added from the Royal Gazette original]</w:t>
       </w:r>
     </w:p>
     <w:p>

</xml_diff>